<commit_message>
Sandy & Junior: revisão da Parte 4
Co-Authored-By: Claude Opus 5.5 <noreply@anthropic.com>
Claude-Session: https://claude.ai/code/session_01MJjUEEZrxQDEUifKK2vj9g
</commit_message>
<xml_diff>
--- a/roteiros/sandy-junior/SJ_Parte4.docx
+++ b/roteiros/sandy-junior/SJ_Parte4.docx
@@ -47,7 +47,7 @@
         <w:rPr>
           <w:color w:val="000000"/>
         </w:rPr>
-        <w:t>Junior começou a montar uma banda de rock. Não queria um projeto qualquer. Queria músicos que o Brasil respeitasse.</w:t>
+        <w:t>Junior começou a montar uma banda de rock. E chamou músicos que o rock brasileiro respeitava.</w:t>
       </w:r>
     </w:p>
     <w:p>
@@ -55,7 +55,7 @@
         <w:rPr>
           <w:color w:val="000000"/>
         </w:rPr>
-        <w:t>O primeiro nome foi um guitarrista baiano chamado Peu Sousa.</w:t>
+        <w:t>Um dos nomes foi um guitarrista baiano chamado Peu Sousa.</w:t>
       </w:r>
     </w:p>
     <w:p>
@@ -71,7 +71,7 @@
         <w:rPr>
           <w:color w:val="000000"/>
         </w:rPr>
-        <w:t>O segundo nome era ainda maior.</w:t>
+        <w:t>Outro nome era ainda maior.</w:t>
       </w:r>
     </w:p>
     <w:p>
@@ -119,7 +119,7 @@
         <w:rPr>
           <w:color w:val="000000"/>
         </w:rPr>
-        <w:t>Era a resposta que ele esperou a vida inteira.</w:t>
+        <w:t>Parecia a resposta que ele tinha esperado a vida inteira.</w:t>
       </w:r>
     </w:p>
     <w:p>
@@ -239,7 +239,7 @@
         <w:rPr>
           <w:color w:val="C00000"/>
         </w:rPr>
-        <w:t>Em dois mil e dez, esse lado entrou pela porta da casa dela. Literalmente. Um homem invadiu o lugar onde a família de Sandy estava. E o que ele disse quando foi encontrado é de arrepiar.</w:t>
+        <w:t>Em dois mil e dez, esse lado entrou pela porta da casa dela. Literalmente. E o que o invasor disse quando foi encontrado é de arrepiar.</w:t>
       </w:r>
     </w:p>
     <w:p>
@@ -271,7 +271,7 @@
         <w:rPr>
           <w:color w:val="000000"/>
         </w:rPr>
-        <w:t>Não era o primeiro episódio. Ao longo dos anos, Sandy já tinha enfrentado invasões de palco e fãs que puxavam o cabelo dela. E houve casos ainda mais graves, de admiradores que chegaram a atentar contra a própria vida dizendo que não suportavam ficar longe dela.</w:t>
+        <w:t>Não era o primeiro episódio. Ao longo dos anos, Sandy já tinha enfrentado invasões de palco e fãs que puxaram o cabelo dela num aeroporto. E houve casos ainda mais graves, de admiradores que chegaram a atentar contra a própria vida dizendo que não suportavam ficar longe dela.</w:t>
       </w:r>
     </w:p>
     <w:p>
@@ -367,15 +367,7 @@
         <w:rPr>
           <w:color w:val="000000"/>
         </w:rPr>
-        <w:t>O país parou.</w:t>
-      </w:r>
-    </w:p>
-    <w:p>
-      <w:r>
-        <w:rPr>
-          <w:color w:val="000000"/>
-        </w:rPr>
-        <w:t>A mesma menina que, aos catorze anos, tinha virado a virgem do Brasil, agora vendia cerveja com a palavra devassa estampada ao lado do rosto. Os comentários se espalharam pelos jornais e pelas redes sociais.</w:t>
+        <w:t>A mesma menina que, aos catorze anos, tinha virado a virgem do Brasil, agora vendia cerveja com a palavra devassa estampada ao lado do rosto. A campanha virou assunto nos jornais e nas redes sociais do país inteiro.</w:t>
       </w:r>
     </w:p>
     <w:p>
@@ -407,7 +399,7 @@
         <w:rPr>
           <w:color w:val="000000"/>
         </w:rPr>
-        <w:t>Vinte e nove de julho de dois mil e onze.</w:t>
+        <w:t>Fim de julho de dois mil e onze.</w:t>
       </w:r>
     </w:p>
     <w:p>
@@ -415,7 +407,7 @@
         <w:rPr>
           <w:color w:val="000000"/>
         </w:rPr>
-        <w:t>A revista Playboy anunciou a edição de aniversário. Na capa, posava a apresentadora Adriane Galisteu. Sandy não posou. Ela tinha dado uma longa entrevista, publicada nas páginas de dentro.</w:t>
+        <w:t>A revista Playboy divulgou a capa da edição de aniversário. Na capa, posava a apresentadora Adriane Galisteu. Sandy não posou. Ela tinha dado uma longa entrevista, publicada nas páginas de dentro.</w:t>
       </w:r>
     </w:p>
     <w:p>
@@ -439,7 +431,7 @@
         <w:rPr>
           <w:color w:val="000000"/>
         </w:rPr>
-        <w:t>Em poucas horas, o nome de Sandy chegou ao segundo lugar entre os assuntos mais comentados do Twitter no mundo inteiro.</w:t>
+        <w:t>Logo depois, o nome de Sandy chegou ao segundo lugar entre os assuntos mais comentados do Twitter no mundo inteiro.</w:t>
       </w:r>
     </w:p>
     <w:p>
@@ -543,7 +535,7 @@
         <w:rPr>
           <w:color w:val="000000"/>
         </w:rPr>
-        <w:t>A morte do amigo destruiu Champignon. Meses depois, ele reuniu antigos integrantes do Charlie Brown Júnior, como Thiago Castanho e Marcão, numa nova banda, A Banca, para manter vivo o legado de Chorão. Em agosto, lançaram a primeira música.</w:t>
+        <w:t>A morte do amigo abalou profundamente Champignon. Meses depois, ele reuniu antigos integrantes do Charlie Brown Júnior, como Thiago Castanho e Marcão, numa nova banda, A Banca, para manter vivo o legado de Chorão. Em agosto, lançaram a primeira música.</w:t>
       </w:r>
     </w:p>
     <w:p>
@@ -559,7 +551,7 @@
         <w:rPr>
           <w:color w:val="000000"/>
         </w:rPr>
-        <w:t>Em Salvador, Peu Sousa atravessava um período difícil. Pessoas próximas, como o irmão dele, falaram depois em anos de luta contra a depressão.</w:t>
+        <w:t>Em Salvador, Peu Sousa atravessava um período difícil. O irmão dele falou depois em anos de luta contra a depressão.</w:t>
       </w:r>
     </w:p>
     <w:p>
@@ -591,7 +583,7 @@
         <w:rPr>
           <w:color w:val="000000"/>
         </w:rPr>
-        <w:t>Peu Sousa morreu em casa, em Salvador. Faltavam dois meses para ele completar trinta e seis anos. A polícia concluiu que ele tirou a própria vida.</w:t>
+        <w:t>Peu Sousa morreu em casa, em Salvador. Tinha trinta e cinco anos. Faltavam pouco mais de dois meses para o aniversário dele. A polícia concluiu que ele tirou a própria vida.</w:t>
       </w:r>
     </w:p>
     <w:p>
@@ -655,7 +647,7 @@
         <w:rPr>
           <w:color w:val="000000"/>
         </w:rPr>
-        <w:t>Junior lamentou publicamente a morte dos amigos. A banda que um dia podia voltar nunca mais ia voltar.</w:t>
+        <w:t>Junior lamentou publicamente a perda. A banda que um dia podia voltar nunca mais ia voltar.</w:t>
       </w:r>
     </w:p>
     <w:p>

</xml_diff>